<commit_message>
Add PdfToSvg.dll and sourcelink.json for Canvas.Infrastructure.Pdf.Tests
</commit_message>
<xml_diff>
--- a/tests/Canvas.Export.Tests/Fidelity/artifacts/latest/checklist-audit/word.docx
+++ b/tests/Canvas.Export.Tests/Fidelity/artifacts/latest/checklist-audit/word.docx
@@ -5,7 +5,7 @@
     <w:p>
       <w:r>
         <w:drawing>
-          <wp:anchor xmlns:wp="http://schemas.openxmlformats.org/drawingml/2006/wordprocessingDrawing" distT="0" distB="0" distL="0" distR="0" relativeHeight="0" behindDoc="0" locked="0" layoutInCell="1" allowOverlap="1">
+          <wp:anchor xmlns:wp="http://schemas.openxmlformats.org/drawingml/2006/wordprocessingDrawing" distT="0" distB="0" distL="0" distR="0" simplePos="0" relativeHeight="0" behindDoc="0" locked="0" layoutInCell="1" allowOverlap="1">
             <wp:simplePos x="0" y="0"/>
             <wp:positionH relativeFrom="page">
               <wp:posOffset>635000</wp:posOffset>
@@ -142,4 +142,13 @@
     </w:sectPr>
   </w:body>
 </w:document>
+</file>
+
+<file path=word/styles.xml><?xml version="1.0" encoding="utf-8"?>
+<w:styles xmlns:w="http://schemas.openxmlformats.org/wordprocessingml/2006/main">
+  <w:style w:type="paragraph" w:styleId="Normal" w:default="true">
+    <w:name w:val="Normal"/>
+    <w:qFormat/>
+  </w:style>
+</w:styles>
 </file>
</xml_diff>